<commit_message>
Created gamedev variant of resume to highly AR/XR projects for jobs relating to AI in games.
</commit_message>
<xml_diff>
--- a/LawrenceDuResume.docx
+++ b/LawrenceDuResume.docx
@@ -51,6 +51,21 @@
           <w:b/>
         </w:rPr>
         <w:t xml:space="preserve">Cloud</w:t>
+      </w:r>
+      <w:r>
+        <w:t xml:space="preserve"> </w:t>
+      </w:r>
+      <w:r>
+        <w:t xml:space="preserve">•</w:t>
+      </w:r>
+      <w:r>
+        <w:t xml:space="preserve"> </w:t>
+      </w:r>
+      <w:r>
+        <w:rPr>
+          <w:b/>
+        </w:rPr>
+        <w:t xml:space="preserve">AR/XR</w:t>
       </w:r>
     </w:p>
     <w:p>
@@ -327,7 +342,7 @@
         <w:pStyle w:val="FirstParagraph"/>
       </w:pPr>
       <w:r>
-        <w:t xml:space="preserve">PyTorch, TensorFlow, Numpy, Numba, Pandas, Sklearn, Flask, AWS, Google Cloud, Terraform, Pulumi, Docker, Metaflow, Kubernetes</w:t>
+        <w:t xml:space="preserve">Unity, Godot, Bevy, PyTorch, TensorFlow, Numpy, Numba, Pandas, Sklearn, Flask, AWS, Google Cloud, Terraform, Pulumi, Docker, Kubernetes</w:t>
       </w:r>
     </w:p>
     <w:p>
@@ -418,7 +433,87 @@
       <w:pPr>
         <w:pStyle w:val="Heading4"/>
       </w:pPr>
-      <w:bookmarkStart w:id="39" w:name="X4be6705311fa4092da8395a90dd684cc3f25e11"/>
+      <w:bookmarkStart w:id="39" w:name="ownerfounder-dugames"/>
+      <w:r>
+        <w:rPr>
+          <w:i/>
+        </w:rPr>
+        <w:t xml:space="preserve">Owner/Founder</w:t>
+      </w:r>
+      <w:r>
+        <w:t xml:space="preserve"> </w:t>
+      </w:r>
+      <w:r>
+        <w:t xml:space="preserve">•</w:t>
+      </w:r>
+      <w:r>
+        <w:t xml:space="preserve"> </w:t>
+      </w:r>
+      <w:hyperlink r:id="rId38">
+        <w:r>
+          <w:rPr>
+            <w:rStyle w:val="Hyperlink"/>
+          </w:rPr>
+          <w:t xml:space="preserve">DuGames</w:t>
+        </w:r>
+      </w:hyperlink>
+      <w:bookmarkEnd w:id="39"/>
+    </w:p>
+    <w:p>
+      <w:pPr>
+        <w:numPr>
+          <w:ilvl w:val="0"/>
+          <w:numId w:val="1001"/>
+        </w:numPr>
+        <w:pStyle w:val="Compact"/>
+      </w:pPr>
+      <w:r>
+        <w:t xml:space="preserve">Solo-developed</w:t>
+      </w:r>
+      <w:r>
+        <w:t xml:space="preserve"> </w:t>
+      </w:r>
+      <w:hyperlink r:id="rId34">
+        <w:r>
+          <w:rPr>
+            <w:rStyle w:val="Hyperlink"/>
+          </w:rPr>
+          <w:t xml:space="preserve">Rogue Stargun</w:t>
+        </w:r>
+      </w:hyperlink>
+      <w:r>
+        <w:t xml:space="preserve">, a pandemic hobby gamedev project that developed into a full fledged shipped VR space shooter sim. Released to Meta Applab in Februrary 2024 and Steam in March 2024.</w:t>
+      </w:r>
+    </w:p>
+    <w:p>
+      <w:pPr>
+        <w:numPr>
+          <w:ilvl w:val="0"/>
+          <w:numId w:val="1001"/>
+        </w:numPr>
+        <w:pStyle w:val="Compact"/>
+      </w:pPr>
+      <w:r>
+        <w:t xml:space="preserve">Developed text-to-speech synthesis integrations for the Unity Game engine editor with ElevenLabs.io, Google Cloud, and Microsoft Azure for rapid single-player campaign dialogue generation. Rogue Stargun was an ElevenLabs Grant Recipient.</w:t>
+      </w:r>
+    </w:p>
+    <w:p>
+      <w:pPr>
+        <w:numPr>
+          <w:ilvl w:val="0"/>
+          <w:numId w:val="1001"/>
+        </w:numPr>
+        <w:pStyle w:val="Compact"/>
+      </w:pPr>
+      <w:r>
+        <w:t xml:space="preserve">Optimized draw calls using static batching, gpu instancing, custom shaders, and baked materials to achieve acceptable (&gt;72 fps) frame rates for the Oculus Quest platform.</w:t>
+      </w:r>
+    </w:p>
+    <w:p>
+      <w:pPr>
+        <w:pStyle w:val="Heading4"/>
+      </w:pPr>
+      <w:bookmarkStart w:id="41" w:name="X4be6705311fa4092da8395a90dd684cc3f25e11"/>
       <w:r>
         <w:rPr>
           <w:i/>
@@ -434,7 +529,7 @@
       <w:r>
         <w:t xml:space="preserve"> </w:t>
       </w:r>
-      <w:hyperlink r:id="rId38">
+      <w:hyperlink r:id="rId40">
         <w:r>
           <w:rPr>
             <w:rStyle w:val="Hyperlink"/>
@@ -442,23 +537,23 @@
           <w:t xml:space="preserve">Freenome</w:t>
         </w:r>
       </w:hyperlink>
-      <w:bookmarkEnd w:id="39"/>
+      <w:bookmarkEnd w:id="41"/>
     </w:p>
     <w:p>
       <w:pPr>
         <w:pStyle w:val="Heading5"/>
       </w:pPr>
-      <w:bookmarkStart w:id="40" w:name="X2dd920d59b718e1378dd46c437811c59c1e45d5"/>
+      <w:bookmarkStart w:id="42" w:name="X2dd920d59b718e1378dd46c437811c59c1e45d5"/>
       <w:r>
         <w:t xml:space="preserve">Aug 2022 - Jun 2024 (South San Francisco, CA)</w:t>
       </w:r>
-      <w:bookmarkEnd w:id="40"/>
+      <w:bookmarkEnd w:id="42"/>
     </w:p>
     <w:p>
       <w:pPr>
         <w:numPr>
           <w:ilvl w:val="0"/>
-          <w:numId w:val="1001"/>
+          <w:numId w:val="1002"/>
         </w:numPr>
         <w:pStyle w:val="Compact"/>
       </w:pPr>
@@ -470,7 +565,7 @@
       <w:pPr>
         <w:numPr>
           <w:ilvl w:val="0"/>
-          <w:numId w:val="1001"/>
+          <w:numId w:val="1002"/>
         </w:numPr>
         <w:pStyle w:val="Compact"/>
       </w:pPr>
@@ -482,7 +577,7 @@
       <w:pPr>
         <w:numPr>
           <w:ilvl w:val="0"/>
-          <w:numId w:val="1001"/>
+          <w:numId w:val="1002"/>
         </w:numPr>
         <w:pStyle w:val="Compact"/>
       </w:pPr>
@@ -494,7 +589,7 @@
       <w:pPr>
         <w:numPr>
           <w:ilvl w:val="0"/>
-          <w:numId w:val="1001"/>
+          <w:numId w:val="1002"/>
         </w:numPr>
         <w:pStyle w:val="Compact"/>
       </w:pPr>
@@ -506,7 +601,7 @@
       <w:pPr>
         <w:pStyle w:val="Heading4"/>
       </w:pPr>
-      <w:bookmarkStart w:id="42" w:name="X2722cff312d522b6965a59dd54c528b3e8d1298"/>
+      <w:bookmarkStart w:id="44" w:name="X2722cff312d522b6965a59dd54c528b3e8d1298"/>
       <w:r>
         <w:rPr>
           <w:i/>
@@ -519,7 +614,7 @@
         </w:rPr>
         <w:t xml:space="preserve"> </w:t>
       </w:r>
-      <w:hyperlink r:id="rId41">
+      <w:hyperlink r:id="rId43">
         <w:r>
           <w:rPr>
             <w:rStyle w:val="Hyperlink"/>
@@ -528,23 +623,23 @@
           <w:t xml:space="preserve">23andMe</w:t>
         </w:r>
       </w:hyperlink>
-      <w:bookmarkEnd w:id="42"/>
+      <w:bookmarkEnd w:id="44"/>
     </w:p>
     <w:p>
       <w:pPr>
         <w:pStyle w:val="Heading5"/>
       </w:pPr>
-      <w:bookmarkStart w:id="43" w:name="nov-2018---aug-2022-sunnyvale-ca"/>
+      <w:bookmarkStart w:id="45" w:name="nov-2018---aug-2022-sunnyvale-ca"/>
       <w:r>
         <w:t xml:space="preserve">Nov 2018 - Aug 2022 (Sunnyvale, CA)</w:t>
       </w:r>
-      <w:bookmarkEnd w:id="43"/>
+      <w:bookmarkEnd w:id="45"/>
     </w:p>
     <w:p>
       <w:pPr>
         <w:numPr>
           <w:ilvl w:val="0"/>
-          <w:numId w:val="1002"/>
+          <w:numId w:val="1003"/>
         </w:numPr>
         <w:pStyle w:val="Compact"/>
       </w:pPr>
@@ -556,7 +651,7 @@
       <w:pPr>
         <w:numPr>
           <w:ilvl w:val="0"/>
-          <w:numId w:val="1002"/>
+          <w:numId w:val="1003"/>
         </w:numPr>
         <w:pStyle w:val="Compact"/>
       </w:pPr>
@@ -568,7 +663,7 @@
       <w:pPr>
         <w:numPr>
           <w:ilvl w:val="0"/>
-          <w:numId w:val="1002"/>
+          <w:numId w:val="1003"/>
         </w:numPr>
         <w:pStyle w:val="Compact"/>
       </w:pPr>
@@ -580,7 +675,7 @@
       <w:pPr>
         <w:numPr>
           <w:ilvl w:val="0"/>
-          <w:numId w:val="1002"/>
+          <w:numId w:val="1003"/>
         </w:numPr>
         <w:pStyle w:val="Compact"/>
       </w:pPr>
@@ -592,7 +687,7 @@
       <w:pPr>
         <w:pStyle w:val="Heading4"/>
       </w:pPr>
-      <w:bookmarkStart w:id="45" w:name="bioinformatician-iv-scripps-research"/>
+      <w:bookmarkStart w:id="47" w:name="bioinformatician-iv-scripps-research"/>
       <w:r>
         <w:rPr>
           <w:i/>
@@ -605,7 +700,7 @@
         </w:rPr>
         <w:t xml:space="preserve"> </w:t>
       </w:r>
-      <w:hyperlink r:id="rId44">
+      <w:hyperlink r:id="rId46">
         <w:r>
           <w:rPr>
             <w:rStyle w:val="Hyperlink"/>
@@ -614,23 +709,23 @@
           <w:t xml:space="preserve">Scripps Research</w:t>
         </w:r>
       </w:hyperlink>
-      <w:bookmarkEnd w:id="45"/>
+      <w:bookmarkEnd w:id="47"/>
     </w:p>
     <w:p>
       <w:pPr>
         <w:pStyle w:val="Heading5"/>
       </w:pPr>
-      <w:bookmarkStart w:id="46" w:name="may-2018---oct-2018-san-diego-ca"/>
+      <w:bookmarkStart w:id="48" w:name="may-2018---oct-2018-san-diego-ca"/>
       <w:r>
         <w:t xml:space="preserve">May 2018 - Oct 2018 (San Diego, CA)</w:t>
       </w:r>
-      <w:bookmarkEnd w:id="46"/>
+      <w:bookmarkEnd w:id="48"/>
     </w:p>
     <w:p>
       <w:pPr>
         <w:numPr>
           <w:ilvl w:val="0"/>
-          <w:numId w:val="1003"/>
+          <w:numId w:val="1004"/>
         </w:numPr>
         <w:pStyle w:val="Compact"/>
       </w:pPr>
@@ -642,7 +737,7 @@
       <w:pPr>
         <w:pStyle w:val="Heading4"/>
       </w:pPr>
-      <w:bookmarkStart w:id="48" w:name="independent-consultant-juno-diagnostics"/>
+      <w:bookmarkStart w:id="50" w:name="independent-consultant-juno-diagnostics"/>
       <w:r>
         <w:rPr>
           <w:i/>
@@ -655,7 +750,7 @@
         </w:rPr>
         <w:t xml:space="preserve"> </w:t>
       </w:r>
-      <w:hyperlink r:id="rId47">
+      <w:hyperlink r:id="rId49">
         <w:r>
           <w:rPr>
             <w:rStyle w:val="Hyperlink"/>
@@ -664,23 +759,23 @@
           <w:t xml:space="preserve">Juno Diagnostics</w:t>
         </w:r>
       </w:hyperlink>
-      <w:bookmarkEnd w:id="48"/>
+      <w:bookmarkEnd w:id="50"/>
     </w:p>
     <w:p>
       <w:pPr>
         <w:pStyle w:val="Heading5"/>
       </w:pPr>
-      <w:bookmarkStart w:id="49" w:name="sept-2017---feb-2018-san-diego-ca"/>
+      <w:bookmarkStart w:id="51" w:name="sept-2017---feb-2018-san-diego-ca"/>
       <w:r>
         <w:t xml:space="preserve">Sept 2017 - Feb 2018 (San Diego, CA)</w:t>
       </w:r>
-      <w:bookmarkEnd w:id="49"/>
+      <w:bookmarkEnd w:id="51"/>
     </w:p>
     <w:p>
       <w:pPr>
         <w:numPr>
           <w:ilvl w:val="0"/>
-          <w:numId w:val="1004"/>
+          <w:numId w:val="1005"/>
         </w:numPr>
         <w:pStyle w:val="Compact"/>
       </w:pPr>
@@ -690,7 +785,7 @@
       <w:r>
         <w:t xml:space="preserve"> </w:t>
       </w:r>
-      <w:hyperlink r:id="rId50">
+      <w:hyperlink r:id="rId52">
         <w:r>
           <w:rPr>
             <w:rStyle w:val="Hyperlink"/>
@@ -709,7 +804,7 @@
       <w:pPr>
         <w:pStyle w:val="Heading4"/>
       </w:pPr>
-      <w:bookmarkStart w:id="52" w:name="data-science-fellow-insight"/>
+      <w:bookmarkStart w:id="54" w:name="data-science-fellow-insight"/>
       <w:r>
         <w:rPr>
           <w:i/>
@@ -722,7 +817,7 @@
         </w:rPr>
         <w:t xml:space="preserve"> </w:t>
       </w:r>
-      <w:hyperlink r:id="rId51">
+      <w:hyperlink r:id="rId53">
         <w:r>
           <w:rPr>
             <w:rStyle w:val="Hyperlink"/>
@@ -731,23 +826,23 @@
           <w:t xml:space="preserve">Insight</w:t>
         </w:r>
       </w:hyperlink>
-      <w:bookmarkEnd w:id="52"/>
+      <w:bookmarkEnd w:id="54"/>
     </w:p>
     <w:p>
       <w:pPr>
         <w:pStyle w:val="Heading5"/>
       </w:pPr>
-      <w:bookmarkStart w:id="53" w:name="X42a73002ed068ca0209a02ea3138a8ef8e4d288"/>
+      <w:bookmarkStart w:id="55" w:name="X42a73002ed068ca0209a02ea3138a8ef8e4d288"/>
       <w:r>
         <w:t xml:space="preserve">Jan 2017 - Apr 2017 (Remote Session - San Diego, CA)</w:t>
       </w:r>
-      <w:bookmarkEnd w:id="53"/>
+      <w:bookmarkEnd w:id="55"/>
     </w:p>
     <w:p>
       <w:pPr>
         <w:numPr>
           <w:ilvl w:val="0"/>
-          <w:numId w:val="1005"/>
+          <w:numId w:val="1006"/>
         </w:numPr>
         <w:pStyle w:val="Compact"/>
       </w:pPr>
@@ -757,7 +852,7 @@
       <w:r>
         <w:t xml:space="preserve"> </w:t>
       </w:r>
-      <w:hyperlink r:id="rId54">
+      <w:hyperlink r:id="rId56">
         <w:r>
           <w:rPr>
             <w:rStyle w:val="Hyperlink"/>
@@ -776,7 +871,7 @@
       <w:pPr>
         <w:pStyle w:val="Heading4"/>
       </w:pPr>
-      <w:bookmarkStart w:id="56" w:name="Xabe380b324b424a0dc96526a86756f6786cdf34"/>
+      <w:bookmarkStart w:id="58" w:name="Xabe380b324b424a0dc96526a86756f6786cdf34"/>
       <w:r>
         <w:rPr>
           <w:i/>
@@ -789,7 +884,7 @@
         </w:rPr>
         <w:t xml:space="preserve"> </w:t>
       </w:r>
-      <w:hyperlink r:id="rId55">
+      <w:hyperlink r:id="rId57">
         <w:r>
           <w:rPr>
             <w:rStyle w:val="Hyperlink"/>
@@ -798,23 +893,23 @@
           <w:t xml:space="preserve">Scott A. Rifkin Lab</w:t>
         </w:r>
       </w:hyperlink>
-      <w:bookmarkEnd w:id="56"/>
+      <w:bookmarkEnd w:id="58"/>
     </w:p>
     <w:p>
       <w:pPr>
         <w:pStyle w:val="Heading5"/>
       </w:pPr>
-      <w:bookmarkStart w:id="57" w:name="aug-2010---may-2017-la-jolla-ca"/>
+      <w:bookmarkStart w:id="59" w:name="aug-2010---may-2017-la-jolla-ca"/>
       <w:r>
         <w:t xml:space="preserve">Aug 2010 - May 2017 (La Jolla, CA)</w:t>
       </w:r>
-      <w:bookmarkEnd w:id="57"/>
+      <w:bookmarkEnd w:id="59"/>
     </w:p>
     <w:p>
       <w:pPr>
         <w:numPr>
           <w:ilvl w:val="0"/>
-          <w:numId w:val="1006"/>
+          <w:numId w:val="1007"/>
         </w:numPr>
         <w:pStyle w:val="Compact"/>
       </w:pPr>
@@ -824,7 +919,7 @@
       <w:r>
         <w:t xml:space="preserve"> </w:t>
       </w:r>
-      <w:hyperlink r:id="rId58">
+      <w:hyperlink r:id="rId60">
         <w:r>
           <w:rPr>
             <w:rStyle w:val="Hyperlink"/>
@@ -843,7 +938,7 @@
       <w:pPr>
         <w:numPr>
           <w:ilvl w:val="0"/>
-          <w:numId w:val="1006"/>
+          <w:numId w:val="1007"/>
         </w:numPr>
         <w:pStyle w:val="Compact"/>
       </w:pPr>
@@ -855,11 +950,11 @@
       <w:pPr>
         <w:pStyle w:val="Heading2"/>
       </w:pPr>
-      <w:bookmarkStart w:id="59" w:name="education"/>
+      <w:bookmarkStart w:id="61" w:name="education"/>
       <w:r>
         <w:t xml:space="preserve">Education</w:t>
       </w:r>
-      <w:bookmarkEnd w:id="59"/>
+      <w:bookmarkEnd w:id="61"/>
     </w:p>
     <w:p>
       <w:pPr>
@@ -902,90 +997,6 @@
       </w:r>
       <w:r>
         <w:t xml:space="preserve">Cornell University, 2006 - 2010</w:t>
-      </w:r>
-    </w:p>
-    <w:p>
-      <w:pPr>
-        <w:pStyle w:val="Heading2"/>
-      </w:pPr>
-      <w:bookmarkStart w:id="60" w:name="activities-and-interests"/>
-      <w:r>
-        <w:t xml:space="preserve">Activities and interests</w:t>
-      </w:r>
-      <w:bookmarkEnd w:id="60"/>
-    </w:p>
-    <w:p>
-      <w:pPr>
-        <w:numPr>
-          <w:ilvl w:val="0"/>
-          <w:numId w:val="1007"/>
-        </w:numPr>
-        <w:pStyle w:val="Compact"/>
-      </w:pPr>
-      <w:hyperlink r:id="rId34">
-        <w:r>
-          <w:rPr>
-            <w:rStyle w:val="Hyperlink"/>
-          </w:rPr>
-          <w:t xml:space="preserve">Developing the VR game Rogue Stargun (https://roguestargun.com)</w:t>
-        </w:r>
-      </w:hyperlink>
-    </w:p>
-    <w:p>
-      <w:pPr>
-        <w:numPr>
-          <w:ilvl w:val="0"/>
-          <w:numId w:val="1007"/>
-        </w:numPr>
-        <w:pStyle w:val="Compact"/>
-      </w:pPr>
-      <w:hyperlink r:id="rId61">
-        <w:r>
-          <w:rPr>
-            <w:rStyle w:val="Hyperlink"/>
-          </w:rPr>
-          <w:t xml:space="preserve">3D modeling with Blender3D</w:t>
-        </w:r>
-      </w:hyperlink>
-    </w:p>
-    <w:p>
-      <w:pPr>
-        <w:numPr>
-          <w:ilvl w:val="0"/>
-          <w:numId w:val="1007"/>
-        </w:numPr>
-        <w:pStyle w:val="Compact"/>
-      </w:pPr>
-      <w:hyperlink r:id="rId62">
-        <w:r>
-          <w:rPr>
-            <w:rStyle w:val="Hyperlink"/>
-          </w:rPr>
-          <w:t xml:space="preserve">Painting</w:t>
-        </w:r>
-      </w:hyperlink>
-    </w:p>
-    <w:p>
-      <w:pPr>
-        <w:numPr>
-          <w:ilvl w:val="0"/>
-          <w:numId w:val="1007"/>
-        </w:numPr>
-        <w:pStyle w:val="Compact"/>
-      </w:pPr>
-      <w:hyperlink r:id="rId36">
-        <w:r>
-          <w:rPr>
-            <w:rStyle w:val="Hyperlink"/>
-          </w:rPr>
-          <w:t xml:space="preserve">DuBlog (https://dublog.net)</w:t>
-        </w:r>
-      </w:hyperlink>
-      <w:r>
-        <w:t xml:space="preserve"> </w:t>
-      </w:r>
-      <w:r>
-        <w:t xml:space="preserve">- Self deployed using Google Cloud, Hugo, and Github Actions</w:t>
       </w:r>
     </w:p>
     <w:sectPr/>

</xml_diff>